<commit_message>
Mejora cobertura de pruebas de GestorTareas
</commit_message>
<xml_diff>
--- a/Bitacora Proyecto Modulo 4.docx
+++ b/Bitacora Proyecto Modulo 4.docx
@@ -13,7 +13,6 @@
           <w:lang w:val="es-CL"/>
         </w:rPr>
       </w:pPr>
-      <w:proofErr w:type="spellStart"/>
       <w:r>
         <w:rPr>
           <w:b/>
@@ -22,9 +21,8 @@
           <w:szCs w:val="32"/>
           <w:lang w:val="es-CL"/>
         </w:rPr>
-        <w:t>Bitacora</w:t>
-      </w:r>
-      <w:proofErr w:type="spellEnd"/>
+        <w:t xml:space="preserve">Bitacora Proyecto Modulo 4 </w:t>
+      </w:r>
       <w:r>
         <w:rPr>
           <w:b/>
@@ -33,7 +31,7 @@
           <w:szCs w:val="32"/>
           <w:lang w:val="es-CL"/>
         </w:rPr>
-        <w:t xml:space="preserve"> Proyecto Modulo 4 </w:t>
+        <w:t>–</w:t>
       </w:r>
       <w:r>
         <w:rPr>
@@ -43,9 +41,12 @@
           <w:szCs w:val="32"/>
           <w:lang w:val="es-CL"/>
         </w:rPr>
-        <w:t>–</w:t>
-      </w:r>
-      <w:r>
+        <w:t xml:space="preserve"> SmartTask</w:t>
+      </w:r>
+    </w:p>
+    <w:p>
+      <w:pPr>
+        <w:jc w:val="center"/>
         <w:rPr>
           <w:b/>
           <w:bCs/>
@@ -53,31 +54,6 @@
           <w:szCs w:val="32"/>
           <w:lang w:val="es-CL"/>
         </w:rPr>
-        <w:t xml:space="preserve"> </w:t>
-      </w:r>
-      <w:proofErr w:type="spellStart"/>
-      <w:r>
-        <w:rPr>
-          <w:b/>
-          <w:bCs/>
-          <w:sz w:val="32"/>
-          <w:szCs w:val="32"/>
-          <w:lang w:val="es-CL"/>
-        </w:rPr>
-        <w:t>SmartTask</w:t>
-      </w:r>
-      <w:proofErr w:type="spellEnd"/>
-    </w:p>
-    <w:p>
-      <w:pPr>
-        <w:jc w:val="center"/>
-        <w:rPr>
-          <w:b/>
-          <w:bCs/>
-          <w:sz w:val="32"/>
-          <w:szCs w:val="32"/>
-          <w:lang w:val="es-CL"/>
-        </w:rPr>
       </w:pPr>
     </w:p>
     <w:p>
@@ -264,21 +240,7 @@
         <w:rPr>
           <w:lang w:val="es-CL"/>
         </w:rPr>
-        <w:t xml:space="preserve">Ingrese </w:t>
-      </w:r>
-      <w:proofErr w:type="spellStart"/>
-      <w:r>
-        <w:rPr>
-          <w:lang w:val="es-CL"/>
-        </w:rPr>
-        <w:t>diasLimite</w:t>
-      </w:r>
-      <w:proofErr w:type="spellEnd"/>
-      <w:r>
-        <w:rPr>
-          <w:lang w:val="es-CL"/>
-        </w:rPr>
-        <w:t>: 120</w:t>
+        <w:t>Ingrese diasLimite: 120</w:t>
       </w:r>
     </w:p>
     <w:p>
@@ -885,21 +847,7 @@
         <w:rPr>
           <w:lang w:val="es-CL"/>
         </w:rPr>
-        <w:t xml:space="preserve">Ingrese </w:t>
-      </w:r>
-      <w:proofErr w:type="spellStart"/>
-      <w:r>
-        <w:rPr>
-          <w:lang w:val="es-CL"/>
-        </w:rPr>
-        <w:t>diasLimite</w:t>
-      </w:r>
-      <w:proofErr w:type="spellEnd"/>
-      <w:r>
-        <w:rPr>
-          <w:lang w:val="es-CL"/>
-        </w:rPr>
-        <w:t>: 120</w:t>
+        <w:t>Ingrese diasLimite: 120</w:t>
       </w:r>
     </w:p>
     <w:p>
@@ -1036,21 +984,7 @@
         <w:rPr>
           <w:lang w:val="es-CL"/>
         </w:rPr>
-        <w:t xml:space="preserve">[URGENTE] ID: 3 | Nombre: Entregar Proyecto | Estado: ACTIVA | </w:t>
-      </w:r>
-      <w:proofErr w:type="spellStart"/>
-      <w:r>
-        <w:rPr>
-          <w:lang w:val="es-CL"/>
-        </w:rPr>
-        <w:t>Dias</w:t>
-      </w:r>
-      <w:proofErr w:type="spellEnd"/>
-      <w:r>
-        <w:rPr>
-          <w:lang w:val="es-CL"/>
-        </w:rPr>
-        <w:t xml:space="preserve"> limite: 120</w:t>
+        <w:t>[URGENTE] ID: 3 | Nombre: Entregar Proyecto | Estado: ACTIVA | Dias limite: 120</w:t>
       </w:r>
     </w:p>
     <w:p>
@@ -1221,21 +1155,7 @@
         <w:rPr>
           <w:lang w:val="es-CL"/>
         </w:rPr>
-        <w:t xml:space="preserve">[URGENTE] ID: 3 | Nombre: Entregar Proyecto | Estado: ACTIVA | </w:t>
-      </w:r>
-      <w:proofErr w:type="spellStart"/>
-      <w:r>
-        <w:rPr>
-          <w:lang w:val="es-CL"/>
-        </w:rPr>
-        <w:t>Dias</w:t>
-      </w:r>
-      <w:proofErr w:type="spellEnd"/>
-      <w:r>
-        <w:rPr>
-          <w:lang w:val="es-CL"/>
-        </w:rPr>
-        <w:t xml:space="preserve"> limite: 120</w:t>
+        <w:t>[URGENTE] ID: 3 | Nombre: Entregar Proyecto | Estado: ACTIVA | Dias limite: 120</w:t>
       </w:r>
     </w:p>
     <w:p>
@@ -1504,21 +1424,7 @@
         <w:rPr>
           <w:lang w:val="es-CL"/>
         </w:rPr>
-        <w:t xml:space="preserve">[URGENTE] ID: 3 | Nombre: Entregar Proyecto | Estado: ACTIVA | </w:t>
-      </w:r>
-      <w:proofErr w:type="spellStart"/>
-      <w:r>
-        <w:rPr>
-          <w:lang w:val="es-CL"/>
-        </w:rPr>
-        <w:t>Dias</w:t>
-      </w:r>
-      <w:proofErr w:type="spellEnd"/>
-      <w:r>
-        <w:rPr>
-          <w:lang w:val="es-CL"/>
-        </w:rPr>
-        <w:t xml:space="preserve"> limite: 120</w:t>
+        <w:t>[URGENTE] ID: 3 | Nombre: Entregar Proyecto | Estado: ACTIVA | Dias limite: 120</w:t>
       </w:r>
     </w:p>
     <w:p>
@@ -1986,9 +1892,153 @@
       <w:pPr>
         <w:rPr>
           <w:u w:val="single"/>
-          <w:lang w:val="es-CL"/>
-        </w:rPr>
-      </w:pPr>
+        </w:rPr>
+      </w:pPr>
+      <w:r>
+        <w:rPr>
+          <w:u w:val="single"/>
+        </w:rPr>
+        <w:lastRenderedPageBreak/>
+        <w:t>Modificaciones en el código y comandos Git:</w:t>
+      </w:r>
+    </w:p>
+    <w:p>
+      <w:pPr>
+        <w:rPr>
+          <w:u w:val="single"/>
+        </w:rPr>
+      </w:pPr>
+    </w:p>
+    <w:p>
+      <w:pPr>
+        <w:rPr>
+          <w:u w:val="single"/>
+        </w:rPr>
+      </w:pPr>
+      <w:r>
+        <w:rPr>
+          <w:u w:val="single"/>
+        </w:rPr>
+        <w:t xml:space="preserve">  se creó el commit; </w:t>
+      </w:r>
+    </w:p>
+    <w:p>
+      <w:pPr>
+        <w:rPr>
+          <w:u w:val="single"/>
+        </w:rPr>
+      </w:pPr>
+      <w:r>
+        <w:rPr>
+          <w:u w:val="single"/>
+        </w:rPr>
+        <w:t xml:space="preserve">  se publicó exitosamente en GitHub; </w:t>
+      </w:r>
+    </w:p>
+    <w:p>
+      <w:pPr>
+        <w:rPr>
+          <w:u w:val="single"/>
+        </w:rPr>
+      </w:pPr>
+      <w:r>
+        <w:rPr>
+          <w:u w:val="single"/>
+        </w:rPr>
+        <w:t>  la rama main quedó sincronizada con origin/main.</w:t>
+      </w:r>
+    </w:p>
+    <w:p>
+      <w:pPr>
+        <w:rPr>
+          <w:u w:val="single"/>
+        </w:rPr>
+      </w:pPr>
+    </w:p>
+    <w:p>
+      <w:r>
+        <w:t xml:space="preserve">  se agregó la prueba testListarTareasSinTareas(); </w:t>
+      </w:r>
+    </w:p>
+    <w:p>
+      <w:r>
+        <w:t xml:space="preserve">  se ejecutaron las </w:t>
+      </w:r>
+      <w:r>
+        <w:rPr>
+          <w:b/>
+          <w:bCs/>
+        </w:rPr>
+        <w:t>4 pruebas</w:t>
+      </w:r>
+      <w:r>
+        <w:t xml:space="preserve">; </w:t>
+      </w:r>
+    </w:p>
+    <w:p>
+      <w:r>
+        <w:t xml:space="preserve">  todas terminaron con Failures: 0 y Errors: 0; </w:t>
+      </w:r>
+    </w:p>
+    <w:p>
+      <w:r>
+        <w:t xml:space="preserve">  JaCoCo mostró </w:t>
+      </w:r>
+      <w:r>
+        <w:rPr>
+          <w:b/>
+          <w:bCs/>
+        </w:rPr>
+        <w:t>58% de cobertura global</w:t>
+      </w:r>
+      <w:r>
+        <w:t xml:space="preserve">; </w:t>
+      </w:r>
+    </w:p>
+    <w:p>
+      <w:r>
+        <w:t xml:space="preserve">  com.smarttask.service alcanzó </w:t>
+      </w:r>
+      <w:r>
+        <w:rPr>
+          <w:b/>
+          <w:bCs/>
+        </w:rPr>
+        <w:t>100%</w:t>
+      </w:r>
+      <w:r>
+        <w:t xml:space="preserve">; </w:t>
+      </w:r>
+    </w:p>
+    <w:p>
+      <w:r>
+        <w:t xml:space="preserve">  com.smarttask.model mantiene </w:t>
+      </w:r>
+      <w:r>
+        <w:rPr>
+          <w:b/>
+          <w:bCs/>
+        </w:rPr>
+        <w:t>96%</w:t>
+      </w:r>
+      <w:r>
+        <w:t xml:space="preserve">; </w:t>
+      </w:r>
+    </w:p>
+    <w:p>
+      <w:r>
+        <w:t xml:space="preserve">  Main permanece en 0% por corresponder a la interfaz de consola; </w:t>
+      </w:r>
+    </w:p>
+    <w:p>
+      <w:pPr>
+        <w:rPr>
+          <w:lang w:val="es-CL"/>
+        </w:rPr>
+      </w:pPr>
+      <w:r>
+        <w:t>  la funcionalidad de consola fue validada mediante ejecución funcional.</w:t>
+      </w:r>
     </w:p>
     <w:sectPr>
       <w:pgSz w:w="12240" w:h="15840"/>
@@ -2653,7 +2703,6 @@
   <w:style w:type="character" w:default="1" w:styleId="Fuentedeprrafopredeter">
     <w:name w:val="Default Paragraph Font"/>
     <w:uiPriority w:val="1"/>
-    <w:semiHidden/>
     <w:unhideWhenUsed/>
   </w:style>
   <w:style w:type="table" w:default="1" w:styleId="Tablanormal">

</xml_diff>

<commit_message>
Corrige compatibilidad Java 26 y actualiza JaCoCo
</commit_message>
<xml_diff>
--- a/Bitacora Proyecto Modulo 4.docx
+++ b/Bitacora Proyecto Modulo 4.docx
@@ -13,6 +13,7 @@
           <w:lang w:val="es-CL"/>
         </w:rPr>
       </w:pPr>
+      <w:proofErr w:type="spellStart"/>
       <w:r>
         <w:rPr>
           <w:b/>
@@ -21,8 +22,9 @@
           <w:szCs w:val="32"/>
           <w:lang w:val="es-CL"/>
         </w:rPr>
-        <w:t xml:space="preserve">Bitacora Proyecto Modulo 4 </w:t>
-      </w:r>
+        <w:t>Bitacora</w:t>
+      </w:r>
+      <w:proofErr w:type="spellEnd"/>
       <w:r>
         <w:rPr>
           <w:b/>
@@ -31,7 +33,7 @@
           <w:szCs w:val="32"/>
           <w:lang w:val="es-CL"/>
         </w:rPr>
-        <w:t>–</w:t>
+        <w:t xml:space="preserve"> Proyecto Modulo 4 </w:t>
       </w:r>
       <w:r>
         <w:rPr>
@@ -41,12 +43,9 @@
           <w:szCs w:val="32"/>
           <w:lang w:val="es-CL"/>
         </w:rPr>
-        <w:t xml:space="preserve"> SmartTask</w:t>
-      </w:r>
-    </w:p>
-    <w:p>
-      <w:pPr>
-        <w:jc w:val="center"/>
+        <w:t>–</w:t>
+      </w:r>
+      <w:r>
         <w:rPr>
           <w:b/>
           <w:bCs/>
@@ -54,6 +53,31 @@
           <w:szCs w:val="32"/>
           <w:lang w:val="es-CL"/>
         </w:rPr>
+        <w:t xml:space="preserve"> </w:t>
+      </w:r>
+      <w:proofErr w:type="spellStart"/>
+      <w:r>
+        <w:rPr>
+          <w:b/>
+          <w:bCs/>
+          <w:sz w:val="32"/>
+          <w:szCs w:val="32"/>
+          <w:lang w:val="es-CL"/>
+        </w:rPr>
+        <w:t>SmartTask</w:t>
+      </w:r>
+      <w:proofErr w:type="spellEnd"/>
+    </w:p>
+    <w:p>
+      <w:pPr>
+        <w:jc w:val="center"/>
+        <w:rPr>
+          <w:b/>
+          <w:bCs/>
+          <w:sz w:val="32"/>
+          <w:szCs w:val="32"/>
+          <w:lang w:val="es-CL"/>
+        </w:rPr>
       </w:pPr>
     </w:p>
     <w:p>
@@ -240,7 +264,21 @@
         <w:rPr>
           <w:lang w:val="es-CL"/>
         </w:rPr>
-        <w:t>Ingrese diasLimite: 120</w:t>
+        <w:t xml:space="preserve">Ingrese </w:t>
+      </w:r>
+      <w:proofErr w:type="spellStart"/>
+      <w:r>
+        <w:rPr>
+          <w:lang w:val="es-CL"/>
+        </w:rPr>
+        <w:t>diasLimite</w:t>
+      </w:r>
+      <w:proofErr w:type="spellEnd"/>
+      <w:r>
+        <w:rPr>
+          <w:lang w:val="es-CL"/>
+        </w:rPr>
+        <w:t>: 120</w:t>
       </w:r>
     </w:p>
     <w:p>
@@ -847,7 +885,21 @@
         <w:rPr>
           <w:lang w:val="es-CL"/>
         </w:rPr>
-        <w:t>Ingrese diasLimite: 120</w:t>
+        <w:t xml:space="preserve">Ingrese </w:t>
+      </w:r>
+      <w:proofErr w:type="spellStart"/>
+      <w:r>
+        <w:rPr>
+          <w:lang w:val="es-CL"/>
+        </w:rPr>
+        <w:t>diasLimite</w:t>
+      </w:r>
+      <w:proofErr w:type="spellEnd"/>
+      <w:r>
+        <w:rPr>
+          <w:lang w:val="es-CL"/>
+        </w:rPr>
+        <w:t>: 120</w:t>
       </w:r>
     </w:p>
     <w:p>
@@ -984,7 +1036,21 @@
         <w:rPr>
           <w:lang w:val="es-CL"/>
         </w:rPr>
-        <w:t>[URGENTE] ID: 3 | Nombre: Entregar Proyecto | Estado: ACTIVA | Dias limite: 120</w:t>
+        <w:t xml:space="preserve">[URGENTE] ID: 3 | Nombre: Entregar Proyecto | Estado: ACTIVA | </w:t>
+      </w:r>
+      <w:proofErr w:type="spellStart"/>
+      <w:r>
+        <w:rPr>
+          <w:lang w:val="es-CL"/>
+        </w:rPr>
+        <w:t>Dias</w:t>
+      </w:r>
+      <w:proofErr w:type="spellEnd"/>
+      <w:r>
+        <w:rPr>
+          <w:lang w:val="es-CL"/>
+        </w:rPr>
+        <w:t xml:space="preserve"> limite: 120</w:t>
       </w:r>
     </w:p>
     <w:p>
@@ -1155,7 +1221,21 @@
         <w:rPr>
           <w:lang w:val="es-CL"/>
         </w:rPr>
-        <w:t>[URGENTE] ID: 3 | Nombre: Entregar Proyecto | Estado: ACTIVA | Dias limite: 120</w:t>
+        <w:t xml:space="preserve">[URGENTE] ID: 3 | Nombre: Entregar Proyecto | Estado: ACTIVA | </w:t>
+      </w:r>
+      <w:proofErr w:type="spellStart"/>
+      <w:r>
+        <w:rPr>
+          <w:lang w:val="es-CL"/>
+        </w:rPr>
+        <w:t>Dias</w:t>
+      </w:r>
+      <w:proofErr w:type="spellEnd"/>
+      <w:r>
+        <w:rPr>
+          <w:lang w:val="es-CL"/>
+        </w:rPr>
+        <w:t xml:space="preserve"> limite: 120</w:t>
       </w:r>
     </w:p>
     <w:p>
@@ -1424,7 +1504,21 @@
         <w:rPr>
           <w:lang w:val="es-CL"/>
         </w:rPr>
-        <w:t>[URGENTE] ID: 3 | Nombre: Entregar Proyecto | Estado: ACTIVA | Dias limite: 120</w:t>
+        <w:t xml:space="preserve">[URGENTE] ID: 3 | Nombre: Entregar Proyecto | Estado: ACTIVA | </w:t>
+      </w:r>
+      <w:proofErr w:type="spellStart"/>
+      <w:r>
+        <w:rPr>
+          <w:lang w:val="es-CL"/>
+        </w:rPr>
+        <w:t>Dias</w:t>
+      </w:r>
+      <w:proofErr w:type="spellEnd"/>
+      <w:r>
+        <w:rPr>
+          <w:lang w:val="es-CL"/>
+        </w:rPr>
+        <w:t xml:space="preserve"> limite: 120</w:t>
       </w:r>
     </w:p>
     <w:p>
@@ -1919,19 +2013,33 @@
         <w:rPr>
           <w:u w:val="single"/>
         </w:rPr>
-        <w:t xml:space="preserve">  se creó el commit; </w:t>
-      </w:r>
-    </w:p>
-    <w:p>
-      <w:pPr>
+        <w:t xml:space="preserve">  se creó el </w:t>
+      </w:r>
+      <w:proofErr w:type="spellStart"/>
+      <w:r>
         <w:rPr>
           <w:u w:val="single"/>
         </w:rPr>
-      </w:pPr>
+        <w:t>commit</w:t>
+      </w:r>
+      <w:proofErr w:type="spellEnd"/>
       <w:r>
         <w:rPr>
           <w:u w:val="single"/>
         </w:rPr>
+        <w:t xml:space="preserve">; </w:t>
+      </w:r>
+    </w:p>
+    <w:p>
+      <w:pPr>
+        <w:rPr>
+          <w:u w:val="single"/>
+        </w:rPr>
+      </w:pPr>
+      <w:r>
+        <w:rPr>
+          <w:u w:val="single"/>
+        </w:rPr>
         <w:t xml:space="preserve">  se publicó exitosamente en GitHub; </w:t>
       </w:r>
     </w:p>
@@ -1945,19 +2053,69 @@
         <w:rPr>
           <w:u w:val="single"/>
         </w:rPr>
-        <w:t>  la rama main quedó sincronizada con origin/main.</w:t>
-      </w:r>
-    </w:p>
-    <w:p>
-      <w:pPr>
+        <w:t xml:space="preserve">  la rama </w:t>
+      </w:r>
+      <w:proofErr w:type="spellStart"/>
+      <w:r>
         <w:rPr>
           <w:u w:val="single"/>
         </w:rPr>
-      </w:pPr>
-    </w:p>
-    <w:p>
-      <w:r>
-        <w:t xml:space="preserve">  se agregó la prueba testListarTareasSinTareas(); </w:t>
+        <w:t>main</w:t>
+      </w:r>
+      <w:proofErr w:type="spellEnd"/>
+      <w:r>
+        <w:rPr>
+          <w:u w:val="single"/>
+        </w:rPr>
+        <w:t xml:space="preserve"> quedó sincronizada con </w:t>
+      </w:r>
+      <w:proofErr w:type="spellStart"/>
+      <w:r>
+        <w:rPr>
+          <w:u w:val="single"/>
+        </w:rPr>
+        <w:t>origin</w:t>
+      </w:r>
+      <w:proofErr w:type="spellEnd"/>
+      <w:r>
+        <w:rPr>
+          <w:u w:val="single"/>
+        </w:rPr>
+        <w:t>/</w:t>
+      </w:r>
+      <w:proofErr w:type="spellStart"/>
+      <w:r>
+        <w:rPr>
+          <w:u w:val="single"/>
+        </w:rPr>
+        <w:t>main</w:t>
+      </w:r>
+      <w:proofErr w:type="spellEnd"/>
+      <w:r>
+        <w:rPr>
+          <w:u w:val="single"/>
+        </w:rPr>
+        <w:t>.</w:t>
+      </w:r>
+    </w:p>
+    <w:p>
+      <w:pPr>
+        <w:rPr>
+          <w:u w:val="single"/>
+        </w:rPr>
+      </w:pPr>
+    </w:p>
+    <w:p>
+      <w:r>
+        <w:t xml:space="preserve">  se agregó la prueba </w:t>
+      </w:r>
+      <w:proofErr w:type="spellStart"/>
+      <w:r>
+        <w:t>testListarTareasSinTareas</w:t>
+      </w:r>
+      <w:proofErr w:type="spellEnd"/>
+      <w:r>
+        <w:t xml:space="preserve">(); </w:t>
       </w:r>
     </w:p>
     <w:p>
@@ -1977,12 +2135,92 @@
     </w:p>
     <w:p>
       <w:r>
-        <w:t xml:space="preserve">  todas terminaron con Failures: 0 y Errors: 0; </w:t>
-      </w:r>
-    </w:p>
-    <w:p>
-      <w:r>
-        <w:t xml:space="preserve">  JaCoCo mostró </w:t>
+        <w:t xml:space="preserve">  todas terminaron con </w:t>
+      </w:r>
+      <w:proofErr w:type="spellStart"/>
+      <w:r>
+        <w:t>Failures</w:t>
+      </w:r>
+      <w:proofErr w:type="spellEnd"/>
+      <w:r>
+        <w:t xml:space="preserve">: 0 y </w:t>
+      </w:r>
+      <w:proofErr w:type="spellStart"/>
+      <w:r>
+        <w:t>Errors</w:t>
+      </w:r>
+      <w:proofErr w:type="spellEnd"/>
+      <w:r>
+        <w:t xml:space="preserve">: 0; </w:t>
+      </w:r>
+    </w:p>
+    <w:p>
+      <w:r>
+        <w:rPr>
+          <w:noProof/>
+        </w:rPr>
+        <w:drawing>
+          <wp:inline distT="0" distB="0" distL="0" distR="0" wp14:anchorId="6E6145E3" wp14:editId="699A10E4">
+            <wp:extent cx="5937409" cy="1304925"/>
+            <wp:effectExtent l="0" t="0" r="6350" b="0"/>
+            <wp:docPr id="515160625" name="Imagen 1"/>
+            <wp:cNvGraphicFramePr>
+              <a:graphicFrameLocks xmlns:a="http://schemas.openxmlformats.org/drawingml/2006/main" noChangeAspect="1"/>
+            </wp:cNvGraphicFramePr>
+            <a:graphic xmlns:a="http://schemas.openxmlformats.org/drawingml/2006/main">
+              <a:graphicData uri="http://schemas.openxmlformats.org/drawingml/2006/picture">
+                <pic:pic xmlns:pic="http://schemas.openxmlformats.org/drawingml/2006/picture">
+                  <pic:nvPicPr>
+                    <pic:cNvPr id="515160625" name=""/>
+                    <pic:cNvPicPr/>
+                  </pic:nvPicPr>
+                  <pic:blipFill rotWithShape="1">
+                    <a:blip r:embed="rId7"/>
+                    <a:srcRect l="-136" t="15388" r="22912" b="52554"/>
+                    <a:stretch>
+                      <a:fillRect/>
+                    </a:stretch>
+                  </pic:blipFill>
+                  <pic:spPr bwMode="auto">
+                    <a:xfrm>
+                      <a:off x="0" y="0"/>
+                      <a:ext cx="5937906" cy="1305034"/>
+                    </a:xfrm>
+                    <a:prstGeom prst="rect">
+                      <a:avLst/>
+                    </a:prstGeom>
+                    <a:ln>
+                      <a:noFill/>
+                    </a:ln>
+                    <a:extLst>
+                      <a:ext uri="{53640926-AAD7-44D8-BBD7-CCE9431645EC}">
+                        <a14:shadowObscured xmlns:a14="http://schemas.microsoft.com/office/drawing/2010/main"/>
+                      </a:ext>
+                    </a:extLst>
+                  </pic:spPr>
+                </pic:pic>
+              </a:graphicData>
+            </a:graphic>
+          </wp:inline>
+        </w:drawing>
+      </w:r>
+    </w:p>
+    <w:p>
+      <w:pPr>
+        <w:rPr>
+          <w:u w:val="single"/>
+        </w:rPr>
+      </w:pPr>
+      <w:r>
+        <w:t xml:space="preserve">  </w:t>
+      </w:r>
+      <w:proofErr w:type="spellStart"/>
+      <w:r>
+        <w:t>JaCoCo</w:t>
+      </w:r>
+      <w:proofErr w:type="spellEnd"/>
+      <w:r>
+        <w:t xml:space="preserve"> mostró </w:t>
       </w:r>
       <w:r>
         <w:rPr>
@@ -1997,7 +2235,15 @@
     </w:p>
     <w:p>
       <w:r>
-        <w:t xml:space="preserve">  com.smarttask.service alcanzó </w:t>
+        <w:t xml:space="preserve">  </w:t>
+      </w:r>
+      <w:proofErr w:type="spellStart"/>
+      <w:r>
+        <w:t>com.smarttask.service</w:t>
+      </w:r>
+      <w:proofErr w:type="spellEnd"/>
+      <w:r>
+        <w:t xml:space="preserve"> alcanzó </w:t>
       </w:r>
       <w:r>
         <w:rPr>
@@ -2012,7 +2258,15 @@
     </w:p>
     <w:p>
       <w:r>
-        <w:t xml:space="preserve">  com.smarttask.model mantiene </w:t>
+        <w:t xml:space="preserve">  </w:t>
+      </w:r>
+      <w:proofErr w:type="spellStart"/>
+      <w:r>
+        <w:t>com.smarttask.model</w:t>
+      </w:r>
+      <w:proofErr w:type="spellEnd"/>
+      <w:r>
+        <w:t xml:space="preserve"> mantiene </w:t>
       </w:r>
       <w:r>
         <w:rPr>
@@ -2031,13 +2285,43 @@
       </w:r>
     </w:p>
     <w:p>
-      <w:pPr>
-        <w:rPr>
-          <w:lang w:val="es-CL"/>
-        </w:rPr>
-      </w:pPr>
       <w:r>
         <w:t>  la funcionalidad de consola fue validada mediante ejecución funcional.</w:t>
+      </w:r>
+    </w:p>
+    <w:p/>
+    <w:p>
+      <w:pPr>
+        <w:rPr>
+          <w:u w:val="single"/>
+          <w:lang w:val="es-CL"/>
+        </w:rPr>
+      </w:pPr>
+      <w:r>
+        <w:rPr>
+          <w:b/>
+          <w:bCs/>
+        </w:rPr>
+        <w:t>Cierre de etapa de pruebas, cobertura y documentación:</w:t>
+      </w:r>
+      <w:r>
+        <w:t xml:space="preserve"> se ejecutaron las pruebas unitarias mediante Maven, obteniendo 4 pruebas ejecutadas, 0 fallos y 0 errores. Se verificó la cobertura mediante </w:t>
+      </w:r>
+      <w:proofErr w:type="spellStart"/>
+      <w:r>
+        <w:t>JaCoCo</w:t>
+      </w:r>
+      <w:proofErr w:type="spellEnd"/>
+      <w:r>
+        <w:t xml:space="preserve">, alcanzando 58% de cobertura global de instrucciones y 60% de ramas, con 100% de cobertura en </w:t>
+      </w:r>
+      <w:proofErr w:type="spellStart"/>
+      <w:r>
+        <w:t>GestorTareas</w:t>
+      </w:r>
+      <w:proofErr w:type="spellEnd"/>
+      <w:r>
+        <w:t>. Se actualizaron README.md y log_tests.txt, se conservaron las evidencias de ejecución y se sincronizaron los cambios mediante Git con el repositorio remoto de GitHub. El proyecto quedó sin cambios pendientes en el árbol de trabajo.</w:t>
       </w:r>
     </w:p>
     <w:sectPr>

</xml_diff>

<commit_message>
Actualiza documentación Bitacora y evidencias del proyecto
</commit_message>
<xml_diff>
--- a/Bitacora Proyecto Modulo 4.docx
+++ b/Bitacora Proyecto Modulo 4.docx
@@ -2009,17 +2009,25 @@
           <w:u w:val="single"/>
         </w:rPr>
       </w:pPr>
+      <w:proofErr w:type="gramStart"/>
       <w:r>
         <w:rPr>
           <w:u w:val="single"/>
         </w:rPr>
-        <w:t xml:space="preserve">  se creó el </w:t>
-      </w:r>
-      <w:proofErr w:type="spellStart"/>
+        <w:t>  se</w:t>
+      </w:r>
+      <w:proofErr w:type="gramEnd"/>
       <w:r>
         <w:rPr>
           <w:u w:val="single"/>
         </w:rPr>
+        <w:t xml:space="preserve"> creó el </w:t>
+      </w:r>
+      <w:proofErr w:type="spellStart"/>
+      <w:r>
+        <w:rPr>
+          <w:u w:val="single"/>
+        </w:rPr>
         <w:t>commit</w:t>
       </w:r>
       <w:proofErr w:type="spellEnd"/>
@@ -2036,30 +2044,46 @@
           <w:u w:val="single"/>
         </w:rPr>
       </w:pPr>
+      <w:proofErr w:type="gramStart"/>
       <w:r>
         <w:rPr>
           <w:u w:val="single"/>
         </w:rPr>
-        <w:t xml:space="preserve">  se publicó exitosamente en GitHub; </w:t>
-      </w:r>
-    </w:p>
-    <w:p>
-      <w:pPr>
+        <w:t>  se</w:t>
+      </w:r>
+      <w:proofErr w:type="gramEnd"/>
+      <w:r>
         <w:rPr>
           <w:u w:val="single"/>
         </w:rPr>
-      </w:pPr>
-      <w:r>
+        <w:t xml:space="preserve"> publicó exitosamente en GitHub; </w:t>
+      </w:r>
+    </w:p>
+    <w:p>
+      <w:pPr>
         <w:rPr>
           <w:u w:val="single"/>
         </w:rPr>
-        <w:t xml:space="preserve">  la rama </w:t>
-      </w:r>
-      <w:proofErr w:type="spellStart"/>
+      </w:pPr>
+      <w:proofErr w:type="gramStart"/>
       <w:r>
         <w:rPr>
           <w:u w:val="single"/>
         </w:rPr>
+        <w:t>  la</w:t>
+      </w:r>
+      <w:proofErr w:type="gramEnd"/>
+      <w:r>
+        <w:rPr>
+          <w:u w:val="single"/>
+        </w:rPr>
+        <w:t xml:space="preserve"> rama </w:t>
+      </w:r>
+      <w:proofErr w:type="spellStart"/>
+      <w:r>
+        <w:rPr>
+          <w:u w:val="single"/>
+        </w:rPr>
         <w:t>main</w:t>
       </w:r>
       <w:proofErr w:type="spellEnd"/>
@@ -2106,21 +2130,36 @@
       </w:pPr>
     </w:p>
     <w:p>
-      <w:r>
-        <w:t xml:space="preserve">  se agregó la prueba </w:t>
-      </w:r>
-      <w:proofErr w:type="spellStart"/>
+      <w:proofErr w:type="gramStart"/>
+      <w:r>
+        <w:t>  se</w:t>
+      </w:r>
+      <w:proofErr w:type="gramEnd"/>
+      <w:r>
+        <w:t xml:space="preserve"> agregó la prueba </w:t>
+      </w:r>
+      <w:proofErr w:type="spellStart"/>
+      <w:proofErr w:type="gramStart"/>
       <w:r>
         <w:t>testListarTareasSinTareas</w:t>
       </w:r>
       <w:proofErr w:type="spellEnd"/>
       <w:r>
-        <w:t xml:space="preserve">(); </w:t>
-      </w:r>
-    </w:p>
-    <w:p>
-      <w:r>
-        <w:t xml:space="preserve">  se ejecutaron las </w:t>
+        <w:t>(</w:t>
+      </w:r>
+      <w:proofErr w:type="gramEnd"/>
+      <w:r>
+        <w:t xml:space="preserve">); </w:t>
+      </w:r>
+    </w:p>
+    <w:p>
+      <w:proofErr w:type="gramStart"/>
+      <w:r>
+        <w:t>  se</w:t>
+      </w:r>
+      <w:proofErr w:type="gramEnd"/>
+      <w:r>
+        <w:t xml:space="preserve"> ejecutaron las </w:t>
       </w:r>
       <w:r>
         <w:rPr>
@@ -2134,8 +2173,13 @@
       </w:r>
     </w:p>
     <w:p>
-      <w:r>
-        <w:t xml:space="preserve">  todas terminaron con </w:t>
+      <w:proofErr w:type="gramStart"/>
+      <w:r>
+        <w:t>  todas</w:t>
+      </w:r>
+      <w:proofErr w:type="gramEnd"/>
+      <w:r>
+        <w:t xml:space="preserve"> terminaron con </w:t>
       </w:r>
       <w:proofErr w:type="spellStart"/>
       <w:r>
@@ -2211,6 +2255,7 @@
           <w:u w:val="single"/>
         </w:rPr>
       </w:pPr>
+      <w:proofErr w:type="gramStart"/>
       <w:r>
         <w:t xml:space="preserve">  </w:t>
       </w:r>
@@ -2219,6 +2264,7 @@
         <w:t>JaCoCo</w:t>
       </w:r>
       <w:proofErr w:type="spellEnd"/>
+      <w:proofErr w:type="gramEnd"/>
       <w:r>
         <w:t xml:space="preserve"> mostró </w:t>
       </w:r>
@@ -2234,14 +2280,24 @@
       </w:r>
     </w:p>
     <w:p>
+      <w:proofErr w:type="gramStart"/>
       <w:r>
         <w:t xml:space="preserve">  </w:t>
       </w:r>
       <w:proofErr w:type="spellStart"/>
       <w:r>
-        <w:t>com.smarttask.service</w:t>
-      </w:r>
-      <w:proofErr w:type="spellEnd"/>
+        <w:t>com</w:t>
+      </w:r>
+      <w:proofErr w:type="gramEnd"/>
+      <w:r>
+        <w:t>.</w:t>
+      </w:r>
+      <w:proofErr w:type="gramStart"/>
+      <w:r>
+        <w:t>smarttask.service</w:t>
+      </w:r>
+      <w:proofErr w:type="spellEnd"/>
+      <w:proofErr w:type="gramEnd"/>
       <w:r>
         <w:t xml:space="preserve"> alcanzó </w:t>
       </w:r>
@@ -2257,14 +2313,24 @@
       </w:r>
     </w:p>
     <w:p>
+      <w:proofErr w:type="gramStart"/>
       <w:r>
         <w:t xml:space="preserve">  </w:t>
       </w:r>
       <w:proofErr w:type="spellStart"/>
       <w:r>
-        <w:t>com.smarttask.model</w:t>
-      </w:r>
-      <w:proofErr w:type="spellEnd"/>
+        <w:t>com</w:t>
+      </w:r>
+      <w:proofErr w:type="gramEnd"/>
+      <w:r>
+        <w:t>.</w:t>
+      </w:r>
+      <w:proofErr w:type="gramStart"/>
+      <w:r>
+        <w:t>smarttask.model</w:t>
+      </w:r>
+      <w:proofErr w:type="spellEnd"/>
+      <w:proofErr w:type="gramEnd"/>
       <w:r>
         <w:t xml:space="preserve"> mantiene </w:t>
       </w:r>
@@ -2280,23 +2346,27 @@
       </w:r>
     </w:p>
     <w:p>
-      <w:r>
-        <w:t xml:space="preserve">  Main permanece en 0% por corresponder a la interfaz de consola; </w:t>
-      </w:r>
-    </w:p>
-    <w:p>
-      <w:r>
-        <w:t>  la funcionalidad de consola fue validada mediante ejecución funcional.</w:t>
+      <w:proofErr w:type="gramStart"/>
+      <w:r>
+        <w:t>  Main</w:t>
+      </w:r>
+      <w:proofErr w:type="gramEnd"/>
+      <w:r>
+        <w:t xml:space="preserve"> permanece en 0% por corresponder a la interfaz de consola; </w:t>
+      </w:r>
+    </w:p>
+    <w:p>
+      <w:proofErr w:type="gramStart"/>
+      <w:r>
+        <w:t>  la</w:t>
+      </w:r>
+      <w:proofErr w:type="gramEnd"/>
+      <w:r>
+        <w:t xml:space="preserve"> funcionalidad de consola fue validada mediante ejecución funcional.</w:t>
       </w:r>
     </w:p>
     <w:p/>
     <w:p>
-      <w:pPr>
-        <w:rPr>
-          <w:u w:val="single"/>
-          <w:lang w:val="es-CL"/>
-        </w:rPr>
-      </w:pPr>
       <w:r>
         <w:rPr>
           <w:b/>
@@ -2324,6 +2394,286 @@
         <w:t>. Se actualizaron README.md y log_tests.txt, se conservaron las evidencias de ejecución y se sincronizaron los cambios mediante Git con el repositorio remoto de GitHub. El proyecto quedó sin cambios pendientes en el árbol de trabajo.</w:t>
       </w:r>
     </w:p>
+    <w:p/>
+    <w:p>
+      <w:r>
+        <w:rPr>
+          <w:b/>
+          <w:bCs/>
+        </w:rPr>
+        <w:lastRenderedPageBreak/>
+        <w:t>15-08-2026 — Corrección de compatibilidad y validación:</w:t>
+      </w:r>
+      <w:r>
+        <w:t xml:space="preserve"> Se actualizó </w:t>
+      </w:r>
+      <w:proofErr w:type="spellStart"/>
+      <w:r>
+        <w:t>JaCoCo</w:t>
+      </w:r>
+      <w:proofErr w:type="spellEnd"/>
+      <w:r>
+        <w:t xml:space="preserve"> de 0.8.12 a 0.8.14 para solucionar incompatibilidad con Java 26. Se configuró Maven </w:t>
+      </w:r>
+      <w:proofErr w:type="spellStart"/>
+      <w:r>
+        <w:t>Compiler</w:t>
+      </w:r>
+      <w:proofErr w:type="spellEnd"/>
+      <w:r>
+        <w:t xml:space="preserve"> mediante </w:t>
+      </w:r>
+      <w:proofErr w:type="spellStart"/>
+      <w:proofErr w:type="gramStart"/>
+      <w:r>
+        <w:t>maven.compiler</w:t>
+      </w:r>
+      <w:proofErr w:type="gramEnd"/>
+      <w:r>
+        <w:t>.release</w:t>
+      </w:r>
+      <w:proofErr w:type="spellEnd"/>
+      <w:r>
+        <w:t xml:space="preserve">=17. Se ejecutaron 4 pruebas </w:t>
+      </w:r>
+      <w:proofErr w:type="spellStart"/>
+      <w:r>
+        <w:t>JUnit</w:t>
+      </w:r>
+      <w:proofErr w:type="spellEnd"/>
+      <w:r>
+        <w:t xml:space="preserve">, todas exitosas (0 fallos, 0 errores). Se generó </w:t>
+      </w:r>
+      <w:r>
+        <w:rPr>
+          <w:u w:val="single"/>
+        </w:rPr>
+        <w:t>correctamente</w:t>
+      </w:r>
+      <w:r>
+        <w:t xml:space="preserve"> el reporte </w:t>
+      </w:r>
+      <w:proofErr w:type="spellStart"/>
+      <w:r>
+        <w:t>JaCoCo</w:t>
+      </w:r>
+      <w:proofErr w:type="spellEnd"/>
+      <w:r>
+        <w:t xml:space="preserve"> y los cambios fueron versionados y publicados en GitHub mediante el </w:t>
+      </w:r>
+      <w:proofErr w:type="spellStart"/>
+      <w:r>
+        <w:t>commit</w:t>
+      </w:r>
+      <w:proofErr w:type="spellEnd"/>
+      <w:r>
+        <w:t xml:space="preserve"> 038d1c9.</w:t>
+      </w:r>
+    </w:p>
+    <w:p/>
+    <w:p>
+      <w:r>
+        <w:rPr>
+          <w:b/>
+          <w:bCs/>
+        </w:rPr>
+        <w:t>15-08-2026 — Medición inicial de cobertura:</w:t>
+      </w:r>
+      <w:r>
+        <w:t xml:space="preserve"> Ejecutado </w:t>
+      </w:r>
+      <w:proofErr w:type="spellStart"/>
+      <w:r>
+        <w:t>mvn</w:t>
+      </w:r>
+      <w:proofErr w:type="spellEnd"/>
+      <w:r>
+        <w:t xml:space="preserve"> </w:t>
+      </w:r>
+      <w:proofErr w:type="spellStart"/>
+      <w:r>
+        <w:t>clean</w:t>
+      </w:r>
+      <w:proofErr w:type="spellEnd"/>
+      <w:r>
+        <w:t xml:space="preserve"> test con </w:t>
+      </w:r>
+      <w:proofErr w:type="spellStart"/>
+      <w:r>
+        <w:t>JaCoCo</w:t>
+      </w:r>
+      <w:proofErr w:type="spellEnd"/>
+      <w:r>
+        <w:t xml:space="preserve"> 0.8.14. Se obtuvieron 4 pruebas exitosas (0 fallos y 0 errores). Cobertura global: 58% de instrucciones, 60% de </w:t>
+      </w:r>
+      <w:proofErr w:type="spellStart"/>
+      <w:r>
+        <w:t>branches</w:t>
+      </w:r>
+      <w:proofErr w:type="spellEnd"/>
+      <w:r>
+        <w:t xml:space="preserve">, 57% de líneas, 83% de métodos y 80% de clases. El paquete </w:t>
+      </w:r>
+      <w:proofErr w:type="spellStart"/>
+      <w:proofErr w:type="gramStart"/>
+      <w:r>
+        <w:t>com.smarttask</w:t>
+      </w:r>
+      <w:proofErr w:type="gramEnd"/>
+      <w:r>
+        <w:t>.service</w:t>
+      </w:r>
+      <w:proofErr w:type="spellEnd"/>
+      <w:r>
+        <w:t xml:space="preserve"> presenta 100% de cobertura y </w:t>
+      </w:r>
+      <w:proofErr w:type="spellStart"/>
+      <w:proofErr w:type="gramStart"/>
+      <w:r>
+        <w:t>com.smarttask</w:t>
+      </w:r>
+      <w:proofErr w:type="gramEnd"/>
+      <w:r>
+        <w:t>.model</w:t>
+      </w:r>
+      <w:proofErr w:type="spellEnd"/>
+      <w:r>
+        <w:t xml:space="preserve"> presenta 96% de instrucciones y 100% de líneas. Se identificó </w:t>
+      </w:r>
+      <w:proofErr w:type="spellStart"/>
+      <w:proofErr w:type="gramStart"/>
+      <w:r>
+        <w:t>com.smarttask</w:t>
+      </w:r>
+      <w:proofErr w:type="spellEnd"/>
+      <w:proofErr w:type="gramEnd"/>
+      <w:r>
+        <w:t xml:space="preserve"> como principal área sin cobertura, con 0% en instrucciones y líneas.</w:t>
+      </w:r>
+    </w:p>
+    <w:p>
+      <w:r>
+        <w:rPr>
+          <w:b/>
+          <w:bCs/>
+        </w:rPr>
+        <w:t>Análisis de cobertura — clase Main:</w:t>
+      </w:r>
+      <w:r>
+        <w:t xml:space="preserve"> Se identificó que el 42% de instrucciones no cubiertas del proyecto se concentra en la clase Main, correspondiente al punto de entrada e interfaz de consola. La clase presenta 0% de cobertura en sus cuatro métodos (</w:t>
+      </w:r>
+      <w:proofErr w:type="spellStart"/>
+      <w:r>
+        <w:t>main</w:t>
+      </w:r>
+      <w:proofErr w:type="spellEnd"/>
+      <w:r>
+        <w:t xml:space="preserve">, </w:t>
+      </w:r>
+      <w:proofErr w:type="spellStart"/>
+      <w:r>
+        <w:t>agregarTarea</w:t>
+      </w:r>
+      <w:proofErr w:type="spellEnd"/>
+      <w:r>
+        <w:t xml:space="preserve">, </w:t>
+      </w:r>
+      <w:proofErr w:type="spellStart"/>
+      <w:r>
+        <w:t>mostrarMenu</w:t>
+      </w:r>
+      <w:proofErr w:type="spellEnd"/>
+      <w:r>
+        <w:t xml:space="preserve"> y constructor). Se decidió analizar su implementación antes de crear nuevas pruebas, evitando generar </w:t>
+      </w:r>
+      <w:proofErr w:type="spellStart"/>
+      <w:r>
+        <w:t>tests</w:t>
+      </w:r>
+      <w:proofErr w:type="spellEnd"/>
+      <w:r>
+        <w:t xml:space="preserve"> artificiales destinados únicamente a incrementar el porcentaje de cobertura.</w:t>
+      </w:r>
+    </w:p>
+    <w:p/>
+    <w:p>
+      <w:r>
+        <w:t xml:space="preserve">Se ejecutó </w:t>
+      </w:r>
+      <w:proofErr w:type="spellStart"/>
+      <w:r>
+        <w:t>mvn</w:t>
+      </w:r>
+      <w:proofErr w:type="spellEnd"/>
+      <w:r>
+        <w:t xml:space="preserve"> </w:t>
+      </w:r>
+      <w:proofErr w:type="spellStart"/>
+      <w:r>
+        <w:t>clean</w:t>
+      </w:r>
+      <w:proofErr w:type="spellEnd"/>
+      <w:r>
+        <w:t xml:space="preserve"> test utilizando Java 26.0.1 y Maven 3.9.16.</w:t>
+      </w:r>
+      <w:r>
+        <w:br/>
+        <w:t xml:space="preserve">Se actualizaron las herramientas de cobertura a </w:t>
+      </w:r>
+      <w:proofErr w:type="spellStart"/>
+      <w:r>
+        <w:t>JaCoCo</w:t>
+      </w:r>
+      <w:proofErr w:type="spellEnd"/>
+      <w:r>
+        <w:t xml:space="preserve"> 0.8.14 para resolver la incompatibilidad con Java 26 detectada anteriormente.</w:t>
+      </w:r>
+      <w:r>
+        <w:br/>
+        <w:t>La ejecución finalizó correctamente con BUILD SUCCESS.</w:t>
+      </w:r>
+      <w:r>
+        <w:br/>
+        <w:t>Se ejecutaron 4 pruebas, con 0 fallos, 0 errores y 0 pruebas omitidas.</w:t>
+      </w:r>
+      <w:r>
+        <w:br/>
+        <w:t xml:space="preserve">La cobertura global obtenida fue de 58% de instrucciones y 60% de </w:t>
+      </w:r>
+      <w:proofErr w:type="spellStart"/>
+      <w:r>
+        <w:t>branches</w:t>
+      </w:r>
+      <w:proofErr w:type="spellEnd"/>
+      <w:r>
+        <w:t>.</w:t>
+      </w:r>
+      <w:r>
+        <w:br/>
+        <w:t xml:space="preserve">El paquete </w:t>
+      </w:r>
+      <w:proofErr w:type="spellStart"/>
+      <w:r>
+        <w:t>com.smarttask.service</w:t>
+      </w:r>
+      <w:proofErr w:type="spellEnd"/>
+      <w:r>
+        <w:t xml:space="preserve"> alcanzó 100% de cobertura y el paquete </w:t>
+      </w:r>
+      <w:proofErr w:type="spellStart"/>
+      <w:r>
+        <w:t>com.smarttask.model</w:t>
+      </w:r>
+      <w:proofErr w:type="spellEnd"/>
+      <w:r>
+        <w:t xml:space="preserve"> alcanzó 96%.</w:t>
+      </w:r>
+      <w:r>
+        <w:br/>
+        <w:t>Se decidió mantener Main sin pruebas adicionales, al no considerarse necesaria dicha mejora para el alcance actual del proyecto.</w:t>
+      </w:r>
+    </w:p>
+    <w:p/>
     <w:sectPr>
       <w:pgSz w:w="12240" w:h="15840"/>
       <w:pgMar w:top="1417" w:right="1701" w:bottom="1417" w:left="1701" w:header="708" w:footer="708" w:gutter="0"/>

</xml_diff>

<commit_message>
Actualiza bitacora con revision tecnica final
</commit_message>
<xml_diff>
--- a/Bitacora Proyecto Modulo 4.docx
+++ b/Bitacora Proyecto Modulo 4.docx
@@ -1961,7 +1961,7 @@
                     <pic:cNvPicPr/>
                   </pic:nvPicPr>
                   <pic:blipFill>
-                    <a:blip r:embed="rId6"/>
+                    <a:blip r:embed="rId7"/>
                     <a:stretch>
                       <a:fillRect/>
                     </a:stretch>
@@ -2219,7 +2219,7 @@
                     <pic:cNvPicPr/>
                   </pic:nvPicPr>
                   <pic:blipFill rotWithShape="1">
-                    <a:blip r:embed="rId7"/>
+                    <a:blip r:embed="rId8"/>
                     <a:srcRect l="-136" t="15388" r="22912" b="52554"/>
                     <a:stretch>
                       <a:fillRect/>
@@ -2673,6 +2673,390 @@
         <w:t>Se decidió mantener Main sin pruebas adicionales, al no considerarse necesaria dicha mejora para el alcance actual del proyecto.</w:t>
       </w:r>
     </w:p>
+    <w:p>
+      <w:r>
+        <w:rPr>
+          <w:b/>
+          <w:bCs/>
+        </w:rPr>
+        <w:t>SMARTTASK</w:t>
+      </w:r>
+    </w:p>
+    <w:p>
+      <w:pPr>
+        <w:numPr>
+          <w:ilvl w:val="0"/>
+          <w:numId w:val="1"/>
+        </w:numPr>
+      </w:pPr>
+      <w:r>
+        <w:t xml:space="preserve">Código revisado </w:t>
+      </w:r>
+      <w:r>
+        <w:rPr>
+          <w:rFonts w:ascii="Segoe UI Emoji" w:hAnsi="Segoe UI Emoji" w:cs="Segoe UI Emoji"/>
+        </w:rPr>
+        <w:t>✅</w:t>
+      </w:r>
+      <w:r>
+        <w:t xml:space="preserve"> </w:t>
+      </w:r>
+    </w:p>
+    <w:p>
+      <w:pPr>
+        <w:numPr>
+          <w:ilvl w:val="0"/>
+          <w:numId w:val="1"/>
+        </w:numPr>
+      </w:pPr>
+      <w:r>
+        <w:t xml:space="preserve">POO revisada </w:t>
+      </w:r>
+      <w:r>
+        <w:rPr>
+          <w:rFonts w:ascii="Segoe UI Emoji" w:hAnsi="Segoe UI Emoji" w:cs="Segoe UI Emoji"/>
+        </w:rPr>
+        <w:t>✅</w:t>
+      </w:r>
+      <w:r>
+        <w:t xml:space="preserve"> </w:t>
+      </w:r>
+    </w:p>
+    <w:p>
+      <w:pPr>
+        <w:numPr>
+          <w:ilvl w:val="0"/>
+          <w:numId w:val="1"/>
+        </w:numPr>
+      </w:pPr>
+      <w:proofErr w:type="spellStart"/>
+      <w:r>
+        <w:t>Tests</w:t>
+      </w:r>
+      <w:proofErr w:type="spellEnd"/>
+      <w:r>
+        <w:t xml:space="preserve">: 4/4 </w:t>
+      </w:r>
+      <w:r>
+        <w:rPr>
+          <w:rFonts w:ascii="Segoe UI Emoji" w:hAnsi="Segoe UI Emoji" w:cs="Segoe UI Emoji"/>
+        </w:rPr>
+        <w:t>✅</w:t>
+      </w:r>
+      <w:r>
+        <w:t xml:space="preserve"> </w:t>
+      </w:r>
+    </w:p>
+    <w:p>
+      <w:pPr>
+        <w:numPr>
+          <w:ilvl w:val="0"/>
+          <w:numId w:val="1"/>
+        </w:numPr>
+      </w:pPr>
+      <w:r>
+        <w:lastRenderedPageBreak/>
+        <w:t xml:space="preserve">BUILD SUCCESS </w:t>
+      </w:r>
+      <w:r>
+        <w:rPr>
+          <w:rFonts w:ascii="Segoe UI Emoji" w:hAnsi="Segoe UI Emoji" w:cs="Segoe UI Emoji"/>
+        </w:rPr>
+        <w:t>✅</w:t>
+      </w:r>
+      <w:r>
+        <w:t xml:space="preserve"> </w:t>
+      </w:r>
+    </w:p>
+    <w:p>
+      <w:pPr>
+        <w:numPr>
+          <w:ilvl w:val="0"/>
+          <w:numId w:val="1"/>
+        </w:numPr>
+      </w:pPr>
+      <w:proofErr w:type="spellStart"/>
+      <w:r>
+        <w:t>JaCoCo</w:t>
+      </w:r>
+      <w:proofErr w:type="spellEnd"/>
+      <w:r>
+        <w:t xml:space="preserve"> 0.8.14 </w:t>
+      </w:r>
+      <w:r>
+        <w:rPr>
+          <w:rFonts w:ascii="Segoe UI Emoji" w:hAnsi="Segoe UI Emoji" w:cs="Segoe UI Emoji"/>
+        </w:rPr>
+        <w:t>✅</w:t>
+      </w:r>
+      <w:r>
+        <w:t xml:space="preserve"> </w:t>
+      </w:r>
+    </w:p>
+    <w:p>
+      <w:pPr>
+        <w:numPr>
+          <w:ilvl w:val="0"/>
+          <w:numId w:val="1"/>
+        </w:numPr>
+      </w:pPr>
+      <w:r>
+        <w:t xml:space="preserve">Cobertura: 58% / 60% </w:t>
+      </w:r>
+      <w:r>
+        <w:rPr>
+          <w:rFonts w:ascii="Segoe UI Emoji" w:hAnsi="Segoe UI Emoji" w:cs="Segoe UI Emoji"/>
+        </w:rPr>
+        <w:t>✅</w:t>
+      </w:r>
+      <w:r>
+        <w:t xml:space="preserve"> </w:t>
+      </w:r>
+    </w:p>
+    <w:p>
+      <w:pPr>
+        <w:numPr>
+          <w:ilvl w:val="0"/>
+          <w:numId w:val="1"/>
+        </w:numPr>
+      </w:pPr>
+      <w:r>
+        <w:t xml:space="preserve">GitHub sincronizado </w:t>
+      </w:r>
+      <w:r>
+        <w:rPr>
+          <w:rFonts w:ascii="Segoe UI Emoji" w:hAnsi="Segoe UI Emoji" w:cs="Segoe UI Emoji"/>
+        </w:rPr>
+        <w:t>✅</w:t>
+      </w:r>
+      <w:r>
+        <w:t xml:space="preserve"> </w:t>
+      </w:r>
+    </w:p>
+    <w:p>
+      <w:pPr>
+        <w:numPr>
+          <w:ilvl w:val="0"/>
+          <w:numId w:val="1"/>
+        </w:numPr>
+      </w:pPr>
+      <w:r>
+        <w:t xml:space="preserve">Working </w:t>
+      </w:r>
+      <w:proofErr w:type="spellStart"/>
+      <w:r>
+        <w:t>tree</w:t>
+      </w:r>
+      <w:proofErr w:type="spellEnd"/>
+      <w:r>
+        <w:t xml:space="preserve"> limpio </w:t>
+      </w:r>
+      <w:r>
+        <w:rPr>
+          <w:rFonts w:ascii="Segoe UI Emoji" w:hAnsi="Segoe UI Emoji" w:cs="Segoe UI Emoji"/>
+        </w:rPr>
+        <w:t>✅</w:t>
+      </w:r>
+      <w:r>
+        <w:t xml:space="preserve"> </w:t>
+      </w:r>
+    </w:p>
+    <w:p>
+      <w:pPr>
+        <w:numPr>
+          <w:ilvl w:val="0"/>
+          <w:numId w:val="1"/>
+        </w:numPr>
+      </w:pPr>
+      <w:r>
+        <w:t xml:space="preserve">Main se mantiene sin pruebas adicionales por decisión tuya </w:t>
+      </w:r>
+      <w:r>
+        <w:rPr>
+          <w:rFonts w:ascii="Segoe UI Emoji" w:hAnsi="Segoe UI Emoji" w:cs="Segoe UI Emoji"/>
+        </w:rPr>
+        <w:t>✅</w:t>
+      </w:r>
+    </w:p>
+    <w:p>
+      <w:pPr>
+        <w:pStyle w:val="pdq2pgselectionanchorcontainer"/>
+        <w:numPr>
+          <w:ilvl w:val="0"/>
+          <w:numId w:val="1"/>
+        </w:numPr>
+      </w:pPr>
+      <w:r>
+        <w:rPr>
+          <w:rStyle w:val="Fuerte"/>
+        </w:rPr>
+        <w:t>Revisión técnica final y validación del código fuente</w:t>
+      </w:r>
+    </w:p>
+    <w:p>
+      <w:pPr>
+        <w:pStyle w:val="NormalWeb"/>
+        <w:numPr>
+          <w:ilvl w:val="0"/>
+          <w:numId w:val="1"/>
+        </w:numPr>
+      </w:pPr>
+      <w:r>
+        <w:t xml:space="preserve">Se realizó una revisión técnica de las clases que conforman SMARTTASK: </w:t>
+      </w:r>
+      <w:r>
+        <w:rPr>
+          <w:rStyle w:val="CdigoHTML"/>
+        </w:rPr>
+        <w:t>Tarea</w:t>
+      </w:r>
+      <w:r>
+        <w:t xml:space="preserve">, </w:t>
+      </w:r>
+      <w:proofErr w:type="spellStart"/>
+      <w:r>
+        <w:rPr>
+          <w:rStyle w:val="CdigoHTML"/>
+        </w:rPr>
+        <w:t>TareaNormal</w:t>
+      </w:r>
+      <w:proofErr w:type="spellEnd"/>
+      <w:r>
+        <w:t xml:space="preserve">, </w:t>
+      </w:r>
+      <w:proofErr w:type="spellStart"/>
+      <w:r>
+        <w:rPr>
+          <w:rStyle w:val="CdigoHTML"/>
+        </w:rPr>
+        <w:t>TareaUrgente</w:t>
+      </w:r>
+      <w:proofErr w:type="spellEnd"/>
+      <w:r>
+        <w:t xml:space="preserve">, </w:t>
+      </w:r>
+      <w:r>
+        <w:rPr>
+          <w:rStyle w:val="CdigoHTML"/>
+        </w:rPr>
+        <w:t>Accionable</w:t>
+      </w:r>
+      <w:r>
+        <w:t xml:space="preserve"> y </w:t>
+      </w:r>
+      <w:proofErr w:type="spellStart"/>
+      <w:r>
+        <w:rPr>
+          <w:rStyle w:val="CdigoHTML"/>
+        </w:rPr>
+        <w:t>GestorTareas</w:t>
+      </w:r>
+      <w:proofErr w:type="spellEnd"/>
+      <w:r>
+        <w:t>.</w:t>
+      </w:r>
+    </w:p>
+    <w:p>
+      <w:pPr>
+        <w:pStyle w:val="NormalWeb"/>
+        <w:numPr>
+          <w:ilvl w:val="0"/>
+          <w:numId w:val="1"/>
+        </w:numPr>
+      </w:pPr>
+      <w:r>
+        <w:t>Se verificó la correcta aplicación de conceptos de Programación Orientada a Objetos, incluyendo encapsulamiento, herencia, abstracción y polimorfismo. También se verificó el uso de colecciones, la asignación automática de identificadores y las operaciones principales de gestión de tareas.</w:t>
+      </w:r>
+    </w:p>
+    <w:p>
+      <w:pPr>
+        <w:pStyle w:val="NormalWeb"/>
+        <w:numPr>
+          <w:ilvl w:val="0"/>
+          <w:numId w:val="1"/>
+        </w:numPr>
+      </w:pPr>
+      <w:r>
+        <w:t xml:space="preserve">No se identificaron modificaciones necesarias para el alcance actual del proyecto. Se decidió mantener </w:t>
+      </w:r>
+      <w:r>
+        <w:rPr>
+          <w:rStyle w:val="CdigoHTML"/>
+        </w:rPr>
+        <w:t>Main</w:t>
+      </w:r>
+      <w:r>
+        <w:t xml:space="preserve"> sin pruebas adicionales, priorizando la cobertura de la lógica de negocio.</w:t>
+      </w:r>
+    </w:p>
+    <w:p>
+      <w:pPr>
+        <w:pStyle w:val="NormalWeb"/>
+        <w:numPr>
+          <w:ilvl w:val="0"/>
+          <w:numId w:val="1"/>
+        </w:numPr>
+      </w:pPr>
+      <w:r>
+        <w:t xml:space="preserve">La ejecución final de Maven mediante </w:t>
+      </w:r>
+      <w:proofErr w:type="spellStart"/>
+      <w:r>
+        <w:rPr>
+          <w:rStyle w:val="CdigoHTML"/>
+        </w:rPr>
+        <w:t>mvn</w:t>
+      </w:r>
+      <w:proofErr w:type="spellEnd"/>
+      <w:r>
+        <w:rPr>
+          <w:rStyle w:val="CdigoHTML"/>
+        </w:rPr>
+        <w:t xml:space="preserve"> </w:t>
+      </w:r>
+      <w:proofErr w:type="spellStart"/>
+      <w:r>
+        <w:rPr>
+          <w:rStyle w:val="CdigoHTML"/>
+        </w:rPr>
+        <w:t>clean</w:t>
+      </w:r>
+      <w:proofErr w:type="spellEnd"/>
+      <w:r>
+        <w:rPr>
+          <w:rStyle w:val="CdigoHTML"/>
+        </w:rPr>
+        <w:t xml:space="preserve"> test</w:t>
+      </w:r>
+      <w:r>
+        <w:t xml:space="preserve"> concluyó con </w:t>
+      </w:r>
+      <w:r>
+        <w:rPr>
+          <w:rStyle w:val="CdigoHTML"/>
+        </w:rPr>
+        <w:t>BUILD SUCCESS</w:t>
+      </w:r>
+      <w:r>
+        <w:t xml:space="preserve">, con 4 pruebas ejecutadas, 0 fallos y 0 errores. La cobertura global registrada por </w:t>
+      </w:r>
+      <w:proofErr w:type="spellStart"/>
+      <w:r>
+        <w:t>JaCoCo</w:t>
+      </w:r>
+      <w:proofErr w:type="spellEnd"/>
+      <w:r>
+        <w:t xml:space="preserve"> fue de 58% de instrucciones y 60% de </w:t>
+      </w:r>
+      <w:proofErr w:type="spellStart"/>
+      <w:r>
+        <w:t>branches</w:t>
+      </w:r>
+      <w:proofErr w:type="spellEnd"/>
+      <w:r>
+        <w:t>.</w:t>
+      </w:r>
+    </w:p>
     <w:p/>
     <w:sectPr>
       <w:pgSz w:w="12240" w:h="15840"/>
@@ -2732,6 +3116,163 @@
     </w:p>
   </w:footnote>
 </w:footnotes>
+</file>
+
+<file path=word/numbering.xml><?xml version="1.0" encoding="utf-8"?>
+<w:numbering xmlns:wpc="http://schemas.microsoft.com/office/word/2010/wordprocessingCanvas" xmlns:cx="http://schemas.microsoft.com/office/drawing/2014/chartex" xmlns:cx1="http://schemas.microsoft.com/office/drawing/2015/9/8/chartex" xmlns:cx2="http://schemas.microsoft.com/office/drawing/2015/10/21/chartex" xmlns:cx3="http://schemas.microsoft.com/office/drawing/2016/5/9/chartex" xmlns:cx4="http://schemas.microsoft.com/office/drawing/2016/5/10/chartex" xmlns:cx5="http://schemas.microsoft.com/office/drawing/2016/5/11/chartex" xmlns:cx6="http://schemas.microsoft.com/office/drawing/2016/5/12/chartex" xmlns:cx7="http://schemas.microsoft.com/office/drawing/2016/5/13/chartex" xmlns:cx8="http://schemas.microsoft.com/office/drawing/2016/5/14/chartex" xmlns:mc="http://schemas.openxmlformats.org/markup-compatibility/2006" xmlns:aink="http://schemas.microsoft.com/office/drawing/2016/ink" xmlns:am3d="http://schemas.microsoft.com/office/drawing/2017/model3d" xmlns:o="urn:schemas-microsoft-com:office:office" xmlns:oel="http://schemas.microsoft.com/office/2019/extlst" xmlns:r="http://schemas.openxmlformats.org/officeDocument/2006/relationships" xmlns:m="http://schemas.openxmlformats.org/officeDocument/2006/math" xmlns:v="urn:schemas-microsoft-com:vml" xmlns:wp14="http://schemas.microsoft.com/office/word/2010/wordprocessingDrawing" xmlns:wp="http://schemas.openxmlformats.org/drawingml/2006/wordprocessingDrawing" xmlns:w10="urn:schemas-microsoft-com:office:word" xmlns:w="http://schemas.openxmlformats.org/wordprocessingml/2006/main" xmlns:w14="http://schemas.microsoft.com/office/word/2010/wordml" xmlns:w15="http://schemas.microsoft.com/office/word/2012/wordml" xmlns:w16cei="http://schemas.microsoft.com/office/word/2026/wordml/cei" xmlns:w16cex="http://schemas.microsoft.com/office/word/2018/wordml/cex" xmlns:w16cid="http://schemas.microsoft.com/office/word/2016/wordml/cid" xmlns:w16="http://schemas.microsoft.com/office/word/2018/wordml" xmlns:w16du="http://schemas.microsoft.com/office/word/2023/wordml/word16du" xmlns:w16sdtdh="http://schemas.microsoft.com/office/word/2020/wordml/sdtdatahash" xmlns:w16sdtfl="http://schemas.microsoft.com/office/word/2024/wordml/sdtformatlock" xmlns:w16se="http://schemas.microsoft.com/office/word/2015/wordml/symex" xmlns:wpg="http://schemas.microsoft.com/office/word/2010/wordprocessingGroup" xmlns:wpi="http://schemas.microsoft.com/office/word/2010/wordprocessingInk" xmlns:wne="http://schemas.microsoft.com/office/word/2006/wordml" xmlns:wps="http://schemas.microsoft.com/office/word/2010/wordprocessingShape" mc:Ignorable="w14 w15 w16se w16cid w16 w16cex w16sdtdh w16sdtfl w16du wp14">
+  <w:abstractNum w:abstractNumId="0" w15:restartNumberingAfterBreak="0">
+    <w:nsid w:val="4C7D0ED0"/>
+    <w:multiLevelType w:val="multilevel"/>
+    <w:tmpl w:val="ED2A1A82"/>
+    <w:lvl w:ilvl="0">
+      <w:start w:val="1"/>
+      <w:numFmt w:val="bullet"/>
+      <w:lvlText w:val=""/>
+      <w:lvlJc w:val="left"/>
+      <w:pPr>
+        <w:tabs>
+          <w:tab w:val="num" w:pos="720"/>
+        </w:tabs>
+        <w:ind w:left="720" w:hanging="360"/>
+      </w:pPr>
+      <w:rPr>
+        <w:rFonts w:ascii="Symbol" w:hAnsi="Symbol" w:hint="default"/>
+        <w:sz w:val="20"/>
+      </w:rPr>
+    </w:lvl>
+    <w:lvl w:ilvl="1" w:tentative="1">
+      <w:start w:val="1"/>
+      <w:numFmt w:val="bullet"/>
+      <w:lvlText w:val="o"/>
+      <w:lvlJc w:val="left"/>
+      <w:pPr>
+        <w:tabs>
+          <w:tab w:val="num" w:pos="1440"/>
+        </w:tabs>
+        <w:ind w:left="1440" w:hanging="360"/>
+      </w:pPr>
+      <w:rPr>
+        <w:rFonts w:ascii="Courier New" w:hAnsi="Courier New" w:hint="default"/>
+        <w:sz w:val="20"/>
+      </w:rPr>
+    </w:lvl>
+    <w:lvl w:ilvl="2" w:tentative="1">
+      <w:start w:val="1"/>
+      <w:numFmt w:val="bullet"/>
+      <w:lvlText w:val=""/>
+      <w:lvlJc w:val="left"/>
+      <w:pPr>
+        <w:tabs>
+          <w:tab w:val="num" w:pos="2160"/>
+        </w:tabs>
+        <w:ind w:left="2160" w:hanging="360"/>
+      </w:pPr>
+      <w:rPr>
+        <w:rFonts w:ascii="Wingdings" w:hAnsi="Wingdings" w:hint="default"/>
+        <w:sz w:val="20"/>
+      </w:rPr>
+    </w:lvl>
+    <w:lvl w:ilvl="3" w:tentative="1">
+      <w:start w:val="1"/>
+      <w:numFmt w:val="bullet"/>
+      <w:lvlText w:val=""/>
+      <w:lvlJc w:val="left"/>
+      <w:pPr>
+        <w:tabs>
+          <w:tab w:val="num" w:pos="2880"/>
+        </w:tabs>
+        <w:ind w:left="2880" w:hanging="360"/>
+      </w:pPr>
+      <w:rPr>
+        <w:rFonts w:ascii="Wingdings" w:hAnsi="Wingdings" w:hint="default"/>
+        <w:sz w:val="20"/>
+      </w:rPr>
+    </w:lvl>
+    <w:lvl w:ilvl="4" w:tentative="1">
+      <w:start w:val="1"/>
+      <w:numFmt w:val="bullet"/>
+      <w:lvlText w:val=""/>
+      <w:lvlJc w:val="left"/>
+      <w:pPr>
+        <w:tabs>
+          <w:tab w:val="num" w:pos="3600"/>
+        </w:tabs>
+        <w:ind w:left="3600" w:hanging="360"/>
+      </w:pPr>
+      <w:rPr>
+        <w:rFonts w:ascii="Wingdings" w:hAnsi="Wingdings" w:hint="default"/>
+        <w:sz w:val="20"/>
+      </w:rPr>
+    </w:lvl>
+    <w:lvl w:ilvl="5" w:tentative="1">
+      <w:start w:val="1"/>
+      <w:numFmt w:val="bullet"/>
+      <w:lvlText w:val=""/>
+      <w:lvlJc w:val="left"/>
+      <w:pPr>
+        <w:tabs>
+          <w:tab w:val="num" w:pos="4320"/>
+        </w:tabs>
+        <w:ind w:left="4320" w:hanging="360"/>
+      </w:pPr>
+      <w:rPr>
+        <w:rFonts w:ascii="Wingdings" w:hAnsi="Wingdings" w:hint="default"/>
+        <w:sz w:val="20"/>
+      </w:rPr>
+    </w:lvl>
+    <w:lvl w:ilvl="6" w:tentative="1">
+      <w:start w:val="1"/>
+      <w:numFmt w:val="bullet"/>
+      <w:lvlText w:val=""/>
+      <w:lvlJc w:val="left"/>
+      <w:pPr>
+        <w:tabs>
+          <w:tab w:val="num" w:pos="5040"/>
+        </w:tabs>
+        <w:ind w:left="5040" w:hanging="360"/>
+      </w:pPr>
+      <w:rPr>
+        <w:rFonts w:ascii="Wingdings" w:hAnsi="Wingdings" w:hint="default"/>
+        <w:sz w:val="20"/>
+      </w:rPr>
+    </w:lvl>
+    <w:lvl w:ilvl="7" w:tentative="1">
+      <w:start w:val="1"/>
+      <w:numFmt w:val="bullet"/>
+      <w:lvlText w:val=""/>
+      <w:lvlJc w:val="left"/>
+      <w:pPr>
+        <w:tabs>
+          <w:tab w:val="num" w:pos="5760"/>
+        </w:tabs>
+        <w:ind w:left="5760" w:hanging="360"/>
+      </w:pPr>
+      <w:rPr>
+        <w:rFonts w:ascii="Wingdings" w:hAnsi="Wingdings" w:hint="default"/>
+        <w:sz w:val="20"/>
+      </w:rPr>
+    </w:lvl>
+    <w:lvl w:ilvl="8" w:tentative="1">
+      <w:start w:val="1"/>
+      <w:numFmt w:val="bullet"/>
+      <w:lvlText w:val=""/>
+      <w:lvlJc w:val="left"/>
+      <w:pPr>
+        <w:tabs>
+          <w:tab w:val="num" w:pos="6480"/>
+        </w:tabs>
+        <w:ind w:left="6480" w:hanging="360"/>
+      </w:pPr>
+      <w:rPr>
+        <w:rFonts w:ascii="Wingdings" w:hAnsi="Wingdings" w:hint="default"/>
+        <w:sz w:val="20"/>
+      </w:rPr>
+    </w:lvl>
+  </w:abstractNum>
+  <w:num w:numId="1" w16cid:durableId="578367037">
+    <w:abstractNumId w:val="0"/>
+  </w:num>
+</w:numbering>
 </file>
 
 <file path=word/styles.xml><?xml version="1.0" encoding="utf-8"?>
@@ -3694,6 +4235,61 @@
     <w:uiPriority w:val="99"/>
     <w:rsid w:val="00B461EE"/>
   </w:style>
+  <w:style w:type="paragraph" w:customStyle="1" w:styleId="pdq2pgselectionanchorcontainer">
+    <w:name w:val="pdq2pg_selectionanchorcontainer"/>
+    <w:basedOn w:val="Normal"/>
+    <w:rsid w:val="0048420A"/>
+    <w:pPr>
+      <w:spacing w:before="100" w:beforeAutospacing="1" w:after="100" w:afterAutospacing="1" w:line="240" w:lineRule="auto"/>
+    </w:pPr>
+    <w:rPr>
+      <w:rFonts w:ascii="Times New Roman" w:eastAsia="Times New Roman" w:hAnsi="Times New Roman" w:cs="Times New Roman"/>
+      <w:kern w:val="0"/>
+      <w:lang w:eastAsia="es-MX"/>
+      <w14:ligatures w14:val="none"/>
+    </w:rPr>
+  </w:style>
+  <w:style w:type="character" w:styleId="Fuerte">
+    <w:name w:val="Strong"/>
+    <w:basedOn w:val="Fuentedeprrafopredeter"/>
+    <w:uiPriority w:val="22"/>
+    <w:qFormat/>
+    <w:rsid w:val="0048420A"/>
+    <w:rPr>
+      <w:b/>
+      <w:bCs/>
+    </w:rPr>
+  </w:style>
+  <w:style w:type="paragraph" w:styleId="NormalWeb">
+    <w:name w:val="Normal (Web)"/>
+    <w:basedOn w:val="Normal"/>
+    <w:uiPriority w:val="99"/>
+    <w:semiHidden/>
+    <w:unhideWhenUsed/>
+    <w:rsid w:val="0048420A"/>
+    <w:pPr>
+      <w:spacing w:before="100" w:beforeAutospacing="1" w:after="100" w:afterAutospacing="1" w:line="240" w:lineRule="auto"/>
+    </w:pPr>
+    <w:rPr>
+      <w:rFonts w:ascii="Times New Roman" w:eastAsia="Times New Roman" w:hAnsi="Times New Roman" w:cs="Times New Roman"/>
+      <w:kern w:val="0"/>
+      <w:lang w:eastAsia="es-MX"/>
+      <w14:ligatures w14:val="none"/>
+    </w:rPr>
+  </w:style>
+  <w:style w:type="character" w:styleId="CdigoHTML">
+    <w:name w:val="HTML Code"/>
+    <w:basedOn w:val="Fuentedeprrafopredeter"/>
+    <w:uiPriority w:val="99"/>
+    <w:semiHidden/>
+    <w:unhideWhenUsed/>
+    <w:rsid w:val="0048420A"/>
+    <w:rPr>
+      <w:rFonts w:ascii="Courier New" w:eastAsia="Times New Roman" w:hAnsi="Courier New" w:cs="Courier New"/>
+      <w:sz w:val="20"/>
+      <w:szCs w:val="20"/>
+    </w:rPr>
+  </w:style>
 </w:styles>
 </file>
 

</xml_diff>